<commit_message>
Rework diagnostic task for system development, no AI use required
- Handout: paper-only tasks. A = code review of a Claude-written
  rank function against a spec (three planted spec violations plus
  an unverifiable "tested" claim), B = write the first request for a
  CSV export feature, C = judge a production config change proposed
  from a generic Claude answer that conflicts with the known facts
- Answer key: solutions, corrected code, scoring checklist, bands,
  facilitation notes updated to the new tasks
- Deck: subtitle, skill descriptions, before/after example, traits,
  AI limits, diagnostic and scoring slides, exercise example and
  summary rewritten for a software development audience

Co-Authored-By: Claude Fable 5.1 <noreply@anthropic.com>
Claude-Session: https://claude.ai/code/session_01UQzmsGbHvNipHhmjBxKuyn
</commit_message>
<xml_diff>
--- a/診断課題_講師用解答.docx
+++ b/診断課題_講師用解答.docx
@@ -14,7 +14,7 @@
           <w:sz w:val="24"/>
           <w:szCs w:val="24"/>
         </w:rPr>
-        <w:t xml:space="preserve">診断課題　講師用</w:t>
+        <w:t xml:space="preserve">診断課題　システム開発編　講師用</w:t>
       </w:r>
     </w:p>
     <w:p>
@@ -64,7 +64,7 @@
         <w:spacing w:after="120" w:line="300"/>
       </w:pPr>
       <w:r>
-        <w:t xml:space="preserve">講義で扱う三つの力を、自己申告ではなく実際の行動で見ます。自己評価では「使われる人」は自分をそう思っていないため見分けられません。</w:t>
+        <w:t xml:space="preserve">講義で扱う三つの力を、自己申告ではなく実際の判断で見ます。参加者はClaudeを使わず、紙の上でAIの出力を扱います。自己評価では「使われる人」は自分をそう思っていないため見分けられません。</w:t>
       </w:r>
     </w:p>
     <w:tbl>
@@ -193,7 +193,7 @@
                 <w:sz w:val="19"/>
                 <w:szCs w:val="19"/>
               </w:rPr>
-              <w:t xml:space="preserve">A　下書きを仕上げる</w:t>
+              <w:t xml:space="preserve">A　コードレビュー</w:t>
             </w:r>
           </w:p>
         </w:tc>
@@ -239,7 +239,7 @@
                 <w:sz w:val="19"/>
                 <w:szCs w:val="19"/>
               </w:rPr>
-              <w:t xml:space="preserve">下書きに誤りを3つ仕込み、元資料と照合するかを見る</w:t>
+              <w:t xml:space="preserve">Claudeのコードに仕様違反を3つ仕込み、説明文には根拠のない「テスト済み」を入れてある</w:t>
             </w:r>
           </w:p>
         </w:tc>
@@ -315,7 +315,7 @@
                 <w:sz w:val="19"/>
                 <w:szCs w:val="19"/>
               </w:rPr>
-              <w:t xml:space="preserve">状況文に材料を7つ散らし、依頼文に何個入るかを見る</w:t>
+              <w:t xml:space="preserve">状況文に材料を散らし、依頼文に何個入るかを見る</w:t>
             </w:r>
           </w:p>
         </w:tc>
@@ -345,7 +345,7 @@
                 <w:sz w:val="19"/>
                 <w:szCs w:val="19"/>
               </w:rPr>
-              <w:t xml:space="preserve">C　送り先を決める</w:t>
+              <w:t xml:space="preserve">C　設定変更の判断</w:t>
             </w:r>
           </w:p>
         </w:tc>
@@ -391,7 +391,7 @@
                 <w:sz w:val="19"/>
                 <w:szCs w:val="19"/>
               </w:rPr>
-              <w:t xml:space="preserve">元資料に対象外の記述があり、資料を知らないClaudeの提案と食い違う</w:t>
+              <w:t xml:space="preserve">Claudeの一般論と、手元の事実が食い違う。事実で提案を修正できるかを見る</w:t>
             </w:r>
           </w:p>
         </w:tc>
@@ -426,7 +426,7 @@
           <w:sz w:val="22"/>
           <w:szCs w:val="22"/>
         </w:rPr>
-        <w:t xml:space="preserve">仕込んだ3つの誤り</w:t>
+        <w:t xml:space="preserve">仕込んだ3つの仕様違反</w:t>
       </w:r>
     </w:p>
     <w:tbl>
@@ -443,9 +443,9 @@
         <w:tblLayout w:type="fixed"/>
       </w:tblPr>
       <w:tblGrid>
-        <w:gridCol w:w="2900"/>
-        <w:gridCol w:w="2900"/>
-        <w:gridCol w:w="3838"/>
+        <w:gridCol w:w="2600"/>
+        <w:gridCol w:w="2600"/>
+        <w:gridCol w:w="4438"/>
       </w:tblGrid>
       <w:tr>
         <w:trPr>
@@ -453,7 +453,7 @@
         </w:trPr>
         <w:tc>
           <w:tcPr>
-            <w:tcW w:type="dxa" w:w="2900"/>
+            <w:tcW w:type="dxa" w:w="2600"/>
             <w:shd w:fill="EEF4F5" w:color="auto" w:val="clear"/>
             <w:tcMar>
               <w:top w:type="dxa" w:w="80"/>
@@ -473,13 +473,13 @@
                 <w:sz w:val="19"/>
                 <w:szCs w:val="19"/>
               </w:rPr>
-              <w:t xml:space="preserve">下書きの記述</w:t>
-            </w:r>
-          </w:p>
-        </w:tc>
-        <w:tc>
-          <w:tcPr>
-            <w:tcW w:type="dxa" w:w="2900"/>
+              <w:t xml:space="preserve">コードの記述</w:t>
+            </w:r>
+          </w:p>
+        </w:tc>
+        <w:tc>
+          <w:tcPr>
+            <w:tcW w:type="dxa" w:w="2600"/>
             <w:shd w:fill="EEF4F5" w:color="auto" w:val="clear"/>
             <w:tcMar>
               <w:top w:type="dxa" w:w="80"/>
@@ -499,13 +499,13 @@
                 <w:sz w:val="19"/>
                 <w:szCs w:val="19"/>
               </w:rPr>
-              <w:t xml:space="preserve">元資料</w:t>
-            </w:r>
-          </w:p>
-        </w:tc>
-        <w:tc>
-          <w:tcPr>
-            <w:tcW w:type="dxa" w:w="3838"/>
+              <w:t xml:space="preserve">仕様</w:t>
+            </w:r>
+          </w:p>
+        </w:tc>
+        <w:tc>
+          <w:tcPr>
+            <w:tcW w:type="dxa" w:w="4438"/>
             <w:shd w:fill="EEF4F5" w:color="auto" w:val="clear"/>
             <w:tcMar>
               <w:top w:type="dxa" w:w="80"/>
@@ -525,7 +525,7 @@
                 <w:sz w:val="19"/>
                 <w:szCs w:val="19"/>
               </w:rPr>
-              <w:t xml:space="preserve">誤りの種類</w:t>
+              <w:t xml:space="preserve">問題</w:t>
             </w:r>
           </w:p>
         </w:tc>
@@ -536,70 +536,70 @@
         </w:trPr>
         <w:tc>
           <w:tcPr>
-            <w:tcW w:type="dxa" w:w="2900"/>
-            <w:tcMar>
-              <w:top w:type="dxa" w:w="80"/>
-              <w:left w:type="dxa" w:w="120"/>
-              <w:bottom w:type="dxa" w:w="80"/>
-              <w:right w:type="dxa" w:w="120"/>
-            </w:tcMar>
-          </w:tcPr>
-          <w:p>
-            <w:pPr>
-              <w:spacing w:after="40" w:line="280"/>
-            </w:pPr>
-            <w:r>
-              <w:rPr>
-                <w:sz w:val="19"/>
-                <w:szCs w:val="19"/>
-              </w:rPr>
-              <w:t xml:space="preserve">4月10日提出分から(件名と本文の2か所)</w:t>
-            </w:r>
-          </w:p>
-        </w:tc>
-        <w:tc>
-          <w:tcPr>
-            <w:tcW w:type="dxa" w:w="2900"/>
-            <w:tcMar>
-              <w:top w:type="dxa" w:w="80"/>
-              <w:left w:type="dxa" w:w="120"/>
-              <w:bottom w:type="dxa" w:w="80"/>
-              <w:right w:type="dxa" w:w="120"/>
-            </w:tcMar>
-          </w:tcPr>
-          <w:p>
-            <w:pPr>
-              <w:spacing w:after="40" w:line="280"/>
-            </w:pPr>
-            <w:r>
-              <w:rPr>
-                <w:sz w:val="19"/>
-                <w:szCs w:val="19"/>
-              </w:rPr>
-              <w:t xml:space="preserve">4月1日提出分から</w:t>
-            </w:r>
-          </w:p>
-        </w:tc>
-        <w:tc>
-          <w:tcPr>
-            <w:tcW w:type="dxa" w:w="3838"/>
-            <w:tcMar>
-              <w:top w:type="dxa" w:w="80"/>
-              <w:left w:type="dxa" w:w="120"/>
-              <w:bottom w:type="dxa" w:w="80"/>
-              <w:right w:type="dxa" w:w="120"/>
-            </w:tcMar>
-          </w:tcPr>
-          <w:p>
-            <w:pPr>
-              <w:spacing w:after="40" w:line="280"/>
-            </w:pPr>
-            <w:r>
-              <w:rPr>
-                <w:sz w:val="19"/>
-                <w:szCs w:val="19"/>
-              </w:rPr>
-              <w:t xml:space="preserve">元資料と違う日付</w:t>
+            <w:tcW w:type="dxa" w:w="2600"/>
+            <w:tcMar>
+              <w:top w:type="dxa" w:w="80"/>
+              <w:left w:type="dxa" w:w="120"/>
+              <w:bottom w:type="dxa" w:w="80"/>
+              <w:right w:type="dxa" w:w="120"/>
+            </w:tcMar>
+          </w:tcPr>
+          <w:p>
+            <w:pPr>
+              <w:spacing w:after="40" w:line="280"/>
+            </w:pPr>
+            <w:r>
+              <w:rPr>
+                <w:sz w:val="19"/>
+                <w:szCs w:val="19"/>
+              </w:rPr>
+              <w:t xml:space="preserve">total &gt; 100_000</w:t>
+            </w:r>
+          </w:p>
+        </w:tc>
+        <w:tc>
+          <w:tcPr>
+            <w:tcW w:type="dxa" w:w="2600"/>
+            <w:tcMar>
+              <w:top w:type="dxa" w:w="80"/>
+              <w:left w:type="dxa" w:w="120"/>
+              <w:bottom w:type="dxa" w:w="80"/>
+              <w:right w:type="dxa" w:w="120"/>
+            </w:tcMar>
+          </w:tcPr>
+          <w:p>
+            <w:pPr>
+              <w:spacing w:after="40" w:line="280"/>
+            </w:pPr>
+            <w:r>
+              <w:rPr>
+                <w:sz w:val="19"/>
+                <w:szCs w:val="19"/>
+              </w:rPr>
+              <w:t xml:space="preserve">4. 合計が100,000円以上ならゴールド</w:t>
+            </w:r>
+          </w:p>
+        </w:tc>
+        <w:tc>
+          <w:tcPr>
+            <w:tcW w:type="dxa" w:w="4438"/>
+            <w:tcMar>
+              <w:top w:type="dxa" w:w="80"/>
+              <w:left w:type="dxa" w:w="120"/>
+              <w:bottom w:type="dxa" w:w="80"/>
+              <w:right w:type="dxa" w:w="120"/>
+            </w:tcMar>
+          </w:tcPr>
+          <w:p>
+            <w:pPr>
+              <w:spacing w:after="40" w:line="280"/>
+            </w:pPr>
+            <w:r>
+              <w:rPr>
+                <w:sz w:val="19"/>
+                <w:szCs w:val="19"/>
+              </w:rPr>
+              <w:t xml:space="preserve">境界値の誤り。100,000円ちょうどがシルバーになる。正しくは &gt;=</w:t>
             </w:r>
           </w:p>
         </w:tc>
@@ -610,70 +610,70 @@
         </w:trPr>
         <w:tc>
           <w:tcPr>
-            <w:tcW w:type="dxa" w:w="2900"/>
-            <w:tcMar>
-              <w:top w:type="dxa" w:w="80"/>
-              <w:left w:type="dxa" w:w="120"/>
-              <w:bottom w:type="dxa" w:w="80"/>
-              <w:right w:type="dxa" w:w="120"/>
-            </w:tcMar>
-          </w:tcPr>
-          <w:p>
-            <w:pPr>
-              <w:spacing w:after="40" w:line="280"/>
-            </w:pPr>
-            <w:r>
-              <w:rPr>
-                <w:sz w:val="19"/>
-                <w:szCs w:val="19"/>
-              </w:rPr>
-              <w:t xml:space="preserve">原本は従来どおり経理部へ提出が必要</w:t>
-            </w:r>
-          </w:p>
-        </w:tc>
-        <w:tc>
-          <w:tcPr>
-            <w:tcW w:type="dxa" w:w="2900"/>
-            <w:tcMar>
-              <w:top w:type="dxa" w:w="80"/>
-              <w:left w:type="dxa" w:w="120"/>
-              <w:bottom w:type="dxa" w:w="80"/>
-              <w:right w:type="dxa" w:w="120"/>
-            </w:tcMar>
-          </w:tcPr>
-          <w:p>
-            <w:pPr>
-              <w:spacing w:after="40" w:line="280"/>
-            </w:pPr>
-            <w:r>
-              <w:rPr>
-                <w:sz w:val="19"/>
-                <w:szCs w:val="19"/>
-              </w:rPr>
-              <w:t xml:space="preserve">原本の提出は不要になる(各自6か月保管)</w:t>
-            </w:r>
-          </w:p>
-        </w:tc>
-        <w:tc>
-          <w:tcPr>
-            <w:tcW w:type="dxa" w:w="3838"/>
-            <w:tcMar>
-              <w:top w:type="dxa" w:w="80"/>
-              <w:left w:type="dxa" w:w="120"/>
-              <w:bottom w:type="dxa" w:w="80"/>
-              <w:right w:type="dxa" w:w="120"/>
-            </w:tcMar>
-          </w:tcPr>
-          <w:p>
-            <w:pPr>
-              <w:spacing w:after="40" w:line="280"/>
-            </w:pPr>
-            <w:r>
-              <w:rPr>
-                <w:sz w:val="19"/>
-                <w:szCs w:val="19"/>
-              </w:rPr>
-              <w:t xml:space="preserve">元資料と逆の内容</w:t>
+            <w:tcW w:type="dxa" w:w="2600"/>
+            <w:tcMar>
+              <w:top w:type="dxa" w:w="80"/>
+              <w:left w:type="dxa" w:w="120"/>
+              <w:bottom w:type="dxa" w:w="80"/>
+              <w:right w:type="dxa" w:w="120"/>
+            </w:tcMar>
+          </w:tcPr>
+          <w:p>
+            <w:pPr>
+              <w:spacing w:after="40" w:line="280"/>
+            </w:pPr>
+            <w:r>
+              <w:rPr>
+                <w:sz w:val="19"/>
+                <w:szCs w:val="19"/>
+              </w:rPr>
+              <w:t xml:space="preserve">o.ordered_at.year == today.year</w:t>
+            </w:r>
+          </w:p>
+        </w:tc>
+        <w:tc>
+          <w:tcPr>
+            <w:tcW w:type="dxa" w:w="2600"/>
+            <w:tcMar>
+              <w:top w:type="dxa" w:w="80"/>
+              <w:left w:type="dxa" w:w="120"/>
+              <w:bottom w:type="dxa" w:w="80"/>
+              <w:right w:type="dxa" w:w="120"/>
+            </w:tcMar>
+          </w:tcPr>
+          <w:p>
+            <w:pPr>
+              <w:spacing w:after="40" w:line="280"/>
+            </w:pPr>
+            <w:r>
+              <w:rPr>
+                <w:sz w:val="19"/>
+                <w:szCs w:val="19"/>
+              </w:rPr>
+              <w:t xml:space="preserve">2. 直近12か月(判定日の12か月前の同日以降)</w:t>
+            </w:r>
+          </w:p>
+        </w:tc>
+        <w:tc>
+          <w:tcPr>
+            <w:tcW w:type="dxa" w:w="4438"/>
+            <w:tcMar>
+              <w:top w:type="dxa" w:w="80"/>
+              <w:left w:type="dxa" w:w="120"/>
+              <w:bottom w:type="dxa" w:w="80"/>
+              <w:right w:type="dxa" w:w="120"/>
+            </w:tcMar>
+          </w:tcPr>
+          <w:p>
+            <w:pPr>
+              <w:spacing w:after="40" w:line="280"/>
+            </w:pPr>
+            <w:r>
+              <w:rPr>
+                <w:sz w:val="19"/>
+                <w:szCs w:val="19"/>
+              </w:rPr>
+              <w:t xml:space="preserve">「今年」の注文しか集計していない。1月に判定すると前年の11か月分が抜ける</w:t>
             </w:r>
           </w:p>
         </w:tc>
@@ -684,70 +684,70 @@
         </w:trPr>
         <w:tc>
           <w:tcPr>
-            <w:tcW w:type="dxa" w:w="2900"/>
-            <w:tcMar>
-              <w:top w:type="dxa" w:w="80"/>
-              <w:left w:type="dxa" w:w="120"/>
-              <w:bottom w:type="dxa" w:w="80"/>
-              <w:right w:type="dxa" w:w="120"/>
-            </w:tcMar>
-          </w:tcPr>
-          <w:p>
-            <w:pPr>
-              <w:spacing w:after="40" w:line="280"/>
-            </w:pPr>
-            <w:r>
-              <w:rPr>
-                <w:sz w:val="19"/>
-                <w:szCs w:val="19"/>
-              </w:rPr>
-              <w:t xml:space="preserve">一件あたりの精算上限は3万円</w:t>
-            </w:r>
-          </w:p>
-        </w:tc>
-        <w:tc>
-          <w:tcPr>
-            <w:tcW w:type="dxa" w:w="2900"/>
-            <w:tcMar>
-              <w:top w:type="dxa" w:w="80"/>
-              <w:left w:type="dxa" w:w="120"/>
-              <w:bottom w:type="dxa" w:w="80"/>
-              <w:right w:type="dxa" w:w="120"/>
-            </w:tcMar>
-          </w:tcPr>
-          <w:p>
-            <w:pPr>
-              <w:spacing w:after="40" w:line="280"/>
-            </w:pPr>
-            <w:r>
-              <w:rPr>
-                <w:sz w:val="19"/>
-                <w:szCs w:val="19"/>
-              </w:rPr>
-              <w:t xml:space="preserve">金額の上限に変更はない(3万円という数字はどこにもない)</w:t>
-            </w:r>
-          </w:p>
-        </w:tc>
-        <w:tc>
-          <w:tcPr>
-            <w:tcW w:type="dxa" w:w="3838"/>
-            <w:tcMar>
-              <w:top w:type="dxa" w:w="80"/>
-              <w:left w:type="dxa" w:w="120"/>
-              <w:bottom w:type="dxa" w:w="80"/>
-              <w:right w:type="dxa" w:w="120"/>
-            </w:tcMar>
-          </w:tcPr>
-          <w:p>
-            <w:pPr>
-              <w:spacing w:after="40" w:line="280"/>
-            </w:pPr>
-            <w:r>
-              <w:rPr>
-                <w:sz w:val="19"/>
-                <w:szCs w:val="19"/>
-              </w:rPr>
-              <w:t xml:space="preserve">元資料にない数字の捏造</w:t>
+            <w:tcW w:type="dxa" w:w="2600"/>
+            <w:tcMar>
+              <w:top w:type="dxa" w:w="80"/>
+              <w:left w:type="dxa" w:w="120"/>
+              <w:bottom w:type="dxa" w:w="80"/>
+              <w:right w:type="dxa" w:w="120"/>
+            </w:tcMar>
+          </w:tcPr>
+          <w:p>
+            <w:pPr>
+              <w:spacing w:after="40" w:line="280"/>
+            </w:pPr>
+            <w:r>
+              <w:rPr>
+                <w:sz w:val="19"/>
+                <w:szCs w:val="19"/>
+              </w:rPr>
+              <w:t xml:space="preserve">status の判定がどこにもない</w:t>
+            </w:r>
+          </w:p>
+        </w:tc>
+        <w:tc>
+          <w:tcPr>
+            <w:tcW w:type="dxa" w:w="2600"/>
+            <w:tcMar>
+              <w:top w:type="dxa" w:w="80"/>
+              <w:left w:type="dxa" w:w="120"/>
+              <w:bottom w:type="dxa" w:w="80"/>
+              <w:right w:type="dxa" w:w="120"/>
+            </w:tcMar>
+          </w:tcPr>
+          <w:p>
+            <w:pPr>
+              <w:spacing w:after="40" w:line="280"/>
+            </w:pPr>
+            <w:r>
+              <w:rPr>
+                <w:sz w:val="19"/>
+                <w:szCs w:val="19"/>
+              </w:rPr>
+              <w:t xml:space="preserve">3. キャンセル注文は合計に含めない</w:t>
+            </w:r>
+          </w:p>
+        </w:tc>
+        <w:tc>
+          <w:tcPr>
+            <w:tcW w:type="dxa" w:w="4438"/>
+            <w:tcMar>
+              <w:top w:type="dxa" w:w="80"/>
+              <w:left w:type="dxa" w:w="120"/>
+              <w:bottom w:type="dxa" w:w="80"/>
+              <w:right w:type="dxa" w:w="120"/>
+            </w:tcMar>
+          </w:tcPr>
+          <w:p>
+            <w:pPr>
+              <w:spacing w:after="40" w:line="280"/>
+            </w:pPr>
+            <w:r>
+              <w:rPr>
+                <w:sz w:val="19"/>
+                <w:szCs w:val="19"/>
+              </w:rPr>
+              <w:t xml:space="preserve">キャンセル済み注文も合計に入る。説明文は「除外しています」と言っているが、コードと一致しない</w:t>
             </w:r>
           </w:p>
         </w:tc>
@@ -755,18 +755,10 @@
     </w:tbl>
     <w:p>
       <w:pPr>
-        <w:spacing w:after="80" w:line="300"/>
+        <w:spacing w:after="120" w:line="300"/>
       </w:pPr>
       <w:r>
         <w:t xml:space="preserve"/>
-      </w:r>
-    </w:p>
-    <w:p>
-      <w:pPr>
-        <w:spacing w:after="160" w:line="300"/>
-      </w:pPr>
-      <w:r>
-        <w:t xml:space="preserve">それ以外の記述(新システム、締切5日、直属上長のみ、ICカード、説明会3月16日15時)は元資料と一致しています。</w:t>
       </w:r>
     </w:p>
     <w:p>
@@ -782,7 +774,55 @@
           <w:sz w:val="22"/>
           <w:szCs w:val="22"/>
         </w:rPr>
-        <w:t xml:space="preserve">仕上がりの例</w:t>
+        <w:t xml:space="preserve">説明文の仕込み</w:t>
+      </w:r>
+    </w:p>
+    <w:p>
+      <w:pPr>
+        <w:spacing w:after="120" w:line="300"/>
+      </w:pPr>
+      <w:r>
+        <w:t xml:space="preserve">「境界値を含むテストも実施し、すべて合格しています」はテストコードが示されていない、根拠のない主張です。100,000円の境界が間違っているので、本当にテストしていれば見つかっているはずです。「テスト済み」という断定を証拠として受け取らないかを見ます。</w:t>
+      </w:r>
+    </w:p>
+    <w:p>
+      <w:pPr>
+        <w:pStyle w:val="Heading3"/>
+        <w:spacing w:after="80" w:before="200"/>
+      </w:pPr>
+      <w:r>
+        <w:rPr>
+          <w:b/>
+          <w:bCs/>
+          <w:color w:val="E36414"/>
+          <w:sz w:val="22"/>
+          <w:szCs w:val="22"/>
+        </w:rPr>
+        <w:t xml:space="preserve">期待される判断</w:t>
+      </w:r>
+    </w:p>
+    <w:p>
+      <w:pPr>
+        <w:spacing w:after="120" w:line="300"/>
+      </w:pPr>
+      <w:r>
+        <w:t xml:space="preserve">「修正が必要」。退会済み判定とシルバーの下限(30,000円)は正しく実装されています。</w:t>
+      </w:r>
+    </w:p>
+    <w:p>
+      <w:pPr>
+        <w:pStyle w:val="Heading3"/>
+        <w:spacing w:after="80" w:before="200"/>
+      </w:pPr>
+      <w:r>
+        <w:rPr>
+          <w:b/>
+          <w:bCs/>
+          <w:color w:val="E36414"/>
+          <w:sz w:val="22"/>
+          <w:szCs w:val="22"/>
+        </w:rPr>
+        <w:t xml:space="preserve">修正例</w:t>
       </w:r>
     </w:p>
     <w:tbl>
@@ -805,6 +845,7 @@
         <w:tc>
           <w:tcPr>
             <w:tcW w:type="dxa" w:w="9638"/>
+            <w:shd w:fill="F4F6F7" w:color="auto" w:val="clear"/>
             <w:tcMar>
               <w:top w:type="dxa" w:w="160"/>
               <w:left w:type="dxa" w:w="200"/>
@@ -814,103 +855,210 @@
           </w:tcPr>
           <w:p>
             <w:pPr>
-              <w:spacing w:after="120" w:line="300"/>
-            </w:pPr>
-            <w:r>
-              <w:rPr>
-                <w:b/>
-                <w:bCs/>
-              </w:rPr>
-              <w:t xml:space="preserve">件名：【重要】経費精算ルール変更のお知らせ(4月1日提出分から)</w:t>
-            </w:r>
-          </w:p>
-          <w:p>
-            <w:pPr>
-              <w:spacing w:after="120" w:line="300"/>
-            </w:pPr>
-            <w:r>
-              <w:t xml:space="preserve">正社員の皆さま</w:t>
-            </w:r>
-          </w:p>
-          <w:p>
-            <w:pPr>
-              <w:spacing w:after="120" w:line="300"/>
-            </w:pPr>
-            <w:r>
-              <w:t xml:space="preserve">経理部です。4月1日提出分より、経費精算のルールが変わります。役員および契約社員の皆さまは従来通りで、今回の変更はありません。</w:t>
-            </w:r>
-          </w:p>
-          <w:p>
-            <w:pPr>
-              <w:pStyle w:val="ListParagraph"/>
-              <w:numPr>
-                <w:ilvl w:val="0"/>
-                <w:numId w:val="2"/>
-              </w:numPr>
-              <w:spacing w:after="60" w:line="300"/>
-            </w:pPr>
-            <w:r>
-              <w:t xml:space="preserve">精算システムが新システム(クラウド)に移行します。</w:t>
-            </w:r>
-          </w:p>
-          <w:p>
-            <w:pPr>
-              <w:pStyle w:val="ListParagraph"/>
-              <w:numPr>
-                <w:ilvl w:val="0"/>
-                <w:numId w:val="2"/>
-              </w:numPr>
-              <w:spacing w:after="60" w:line="300"/>
-            </w:pPr>
-            <w:r>
-              <w:t xml:space="preserve">領収書は撮影してアップロードしてください。原本の経理部への提出は不要になりますが、各自6か月間保管してください。</w:t>
-            </w:r>
-          </w:p>
-          <w:p>
-            <w:pPr>
-              <w:pStyle w:val="ListParagraph"/>
-              <w:numPr>
-                <w:ilvl w:val="0"/>
-                <w:numId w:val="2"/>
-              </w:numPr>
-              <w:spacing w:after="60" w:line="300"/>
-            </w:pPr>
-            <w:r>
-              <w:t xml:space="preserve">申請締切は毎月10日から毎月5日に変わります。</w:t>
-            </w:r>
-          </w:p>
-          <w:p>
-            <w:pPr>
-              <w:pStyle w:val="ListParagraph"/>
-              <w:numPr>
-                <w:ilvl w:val="0"/>
-                <w:numId w:val="2"/>
-              </w:numPr>
-              <w:spacing w:after="60" w:line="300"/>
-            </w:pPr>
-            <w:r>
-              <w:t xml:space="preserve">承認は直属上長のみとなり、部長承認は廃止されます。</w:t>
-            </w:r>
-          </w:p>
-          <w:p>
-            <w:pPr>
-              <w:pStyle w:val="ListParagraph"/>
-              <w:numPr>
-                <w:ilvl w:val="0"/>
-                <w:numId w:val="2"/>
-              </w:numPr>
-              <w:spacing w:after="60" w:line="300"/>
-            </w:pPr>
-            <w:r>
-              <w:t xml:space="preserve">交通費はICカード履歴の取り込みに対応します。金額の上限に変更はありません。</w:t>
-            </w:r>
-          </w:p>
-          <w:p>
-            <w:pPr>
-              <w:spacing w:after="0" w:line="300"/>
-            </w:pPr>
-            <w:r>
-              <w:t xml:space="preserve">説明会を3月16日15時からオンラインで行います。ご不明点は経理部(keiri@example.co.jp)までお問い合わせください。</w:t>
+              <w:spacing w:after="0" w:line="260"/>
+            </w:pPr>
+            <w:r>
+              <w:rPr>
+                <w:rFonts w:ascii="Consolas" w:cs="Consolas" w:eastAsia="Meiryo" w:hAnsi="Consolas"/>
+                <w:sz w:val="18"/>
+                <w:szCs w:val="18"/>
+              </w:rPr>
+              <w:t xml:space="preserve">from datetime import date</w:t>
+            </w:r>
+          </w:p>
+          <w:p>
+            <w:pPr>
+              <w:spacing w:after="0" w:line="260"/>
+            </w:pPr>
+            <w:r>
+              <w:rPr>
+                <w:rFonts w:ascii="Consolas" w:cs="Consolas" w:eastAsia="Meiryo" w:hAnsi="Consolas"/>
+                <w:sz w:val="18"/>
+                <w:szCs w:val="18"/>
+              </w:rPr>
+              <w:t xml:space="preserve">from dateutil.relativedelta import relativedelta</w:t>
+            </w:r>
+          </w:p>
+          <w:p>
+            <w:pPr>
+              <w:spacing w:after="0" w:line="260"/>
+            </w:pPr>
+            <w:r>
+              <w:rPr>
+                <w:rFonts w:ascii="Consolas" w:cs="Consolas" w:eastAsia="Meiryo" w:hAnsi="Consolas"/>
+                <w:sz w:val="18"/>
+                <w:szCs w:val="18"/>
+              </w:rPr>
+              <w:t xml:space="preserve"> </w:t>
+            </w:r>
+          </w:p>
+          <w:p>
+            <w:pPr>
+              <w:spacing w:after="0" w:line="260"/>
+            </w:pPr>
+            <w:r>
+              <w:rPr>
+                <w:rFonts w:ascii="Consolas" w:cs="Consolas" w:eastAsia="Meiryo" w:hAnsi="Consolas"/>
+                <w:sz w:val="18"/>
+                <w:szCs w:val="18"/>
+              </w:rPr>
+              <w:t xml:space="preserve">def judge_rank(member, orders, today: date) -&gt; str:</w:t>
+            </w:r>
+          </w:p>
+          <w:p>
+            <w:pPr>
+              <w:spacing w:after="0" w:line="260"/>
+            </w:pPr>
+            <w:r>
+              <w:rPr>
+                <w:rFonts w:ascii="Consolas" w:cs="Consolas" w:eastAsia="Meiryo" w:hAnsi="Consolas"/>
+                <w:sz w:val="18"/>
+                <w:szCs w:val="18"/>
+              </w:rPr>
+              <w:t xml:space="preserve">    if member.withdrawn:</w:t>
+            </w:r>
+          </w:p>
+          <w:p>
+            <w:pPr>
+              <w:spacing w:after="0" w:line="260"/>
+            </w:pPr>
+            <w:r>
+              <w:rPr>
+                <w:rFonts w:ascii="Consolas" w:cs="Consolas" w:eastAsia="Meiryo" w:hAnsi="Consolas"/>
+                <w:sz w:val="18"/>
+                <w:szCs w:val="18"/>
+              </w:rPr>
+              <w:t xml:space="preserve">        return "なし"</w:t>
+            </w:r>
+          </w:p>
+          <w:p>
+            <w:pPr>
+              <w:spacing w:after="0" w:line="260"/>
+            </w:pPr>
+            <w:r>
+              <w:rPr>
+                <w:rFonts w:ascii="Consolas" w:cs="Consolas" w:eastAsia="Meiryo" w:hAnsi="Consolas"/>
+                <w:sz w:val="18"/>
+                <w:szCs w:val="18"/>
+              </w:rPr>
+              <w:t xml:space="preserve">    since = today - relativedelta(months=12)</w:t>
+            </w:r>
+          </w:p>
+          <w:p>
+            <w:pPr>
+              <w:spacing w:after="0" w:line="260"/>
+            </w:pPr>
+            <w:r>
+              <w:rPr>
+                <w:rFonts w:ascii="Consolas" w:cs="Consolas" w:eastAsia="Meiryo" w:hAnsi="Consolas"/>
+                <w:sz w:val="18"/>
+                <w:szCs w:val="18"/>
+              </w:rPr>
+              <w:t xml:space="preserve">    total = sum(</w:t>
+            </w:r>
+          </w:p>
+          <w:p>
+            <w:pPr>
+              <w:spacing w:after="0" w:line="260"/>
+            </w:pPr>
+            <w:r>
+              <w:rPr>
+                <w:rFonts w:ascii="Consolas" w:cs="Consolas" w:eastAsia="Meiryo" w:hAnsi="Consolas"/>
+                <w:sz w:val="18"/>
+                <w:szCs w:val="18"/>
+              </w:rPr>
+              <w:t xml:space="preserve">        o.amount for o in orders</w:t>
+            </w:r>
+          </w:p>
+          <w:p>
+            <w:pPr>
+              <w:spacing w:after="0" w:line="260"/>
+            </w:pPr>
+            <w:r>
+              <w:rPr>
+                <w:rFonts w:ascii="Consolas" w:cs="Consolas" w:eastAsia="Meiryo" w:hAnsi="Consolas"/>
+                <w:sz w:val="18"/>
+                <w:szCs w:val="18"/>
+              </w:rPr>
+              <w:t xml:space="preserve">        if o.status != "cancelled" and since &lt;= o.ordered_at &lt;= today</w:t>
+            </w:r>
+          </w:p>
+          <w:p>
+            <w:pPr>
+              <w:spacing w:after="0" w:line="260"/>
+            </w:pPr>
+            <w:r>
+              <w:rPr>
+                <w:rFonts w:ascii="Consolas" w:cs="Consolas" w:eastAsia="Meiryo" w:hAnsi="Consolas"/>
+                <w:sz w:val="18"/>
+                <w:szCs w:val="18"/>
+              </w:rPr>
+              <w:t xml:space="preserve">    )</w:t>
+            </w:r>
+          </w:p>
+          <w:p>
+            <w:pPr>
+              <w:spacing w:after="0" w:line="260"/>
+            </w:pPr>
+            <w:r>
+              <w:rPr>
+                <w:rFonts w:ascii="Consolas" w:cs="Consolas" w:eastAsia="Meiryo" w:hAnsi="Consolas"/>
+                <w:sz w:val="18"/>
+                <w:szCs w:val="18"/>
+              </w:rPr>
+              <w:t xml:space="preserve">    if total &gt;= 100_000:</w:t>
+            </w:r>
+          </w:p>
+          <w:p>
+            <w:pPr>
+              <w:spacing w:after="0" w:line="260"/>
+            </w:pPr>
+            <w:r>
+              <w:rPr>
+                <w:rFonts w:ascii="Consolas" w:cs="Consolas" w:eastAsia="Meiryo" w:hAnsi="Consolas"/>
+                <w:sz w:val="18"/>
+                <w:szCs w:val="18"/>
+              </w:rPr>
+              <w:t xml:space="preserve">        return "ゴールド"</w:t>
+            </w:r>
+          </w:p>
+          <w:p>
+            <w:pPr>
+              <w:spacing w:after="0" w:line="260"/>
+            </w:pPr>
+            <w:r>
+              <w:rPr>
+                <w:rFonts w:ascii="Consolas" w:cs="Consolas" w:eastAsia="Meiryo" w:hAnsi="Consolas"/>
+                <w:sz w:val="18"/>
+                <w:szCs w:val="18"/>
+              </w:rPr>
+              <w:t xml:space="preserve">    if total &gt;= 30_000:</w:t>
+            </w:r>
+          </w:p>
+          <w:p>
+            <w:pPr>
+              <w:spacing w:after="0" w:line="260"/>
+            </w:pPr>
+            <w:r>
+              <w:rPr>
+                <w:rFonts w:ascii="Consolas" w:cs="Consolas" w:eastAsia="Meiryo" w:hAnsi="Consolas"/>
+                <w:sz w:val="18"/>
+                <w:szCs w:val="18"/>
+              </w:rPr>
+              <w:t xml:space="preserve">        return "シルバー"</w:t>
+            </w:r>
+          </w:p>
+          <w:p>
+            <w:pPr>
+              <w:spacing w:after="0" w:line="260"/>
+            </w:pPr>
+            <w:r>
+              <w:rPr>
+                <w:rFonts w:ascii="Consolas" w:cs="Consolas" w:eastAsia="Meiryo" w:hAnsi="Consolas"/>
+                <w:sz w:val="18"/>
+                <w:szCs w:val="18"/>
+              </w:rPr>
+              <w:t xml:space="preserve">    return "ブロンズ"</w:t>
             </w:r>
           </w:p>
         </w:tc>
@@ -950,7 +1098,7 @@
         <w:spacing w:after="60" w:line="300"/>
       </w:pPr>
       <w:r>
-        <w:t xml:space="preserve">誤りを何個見つけたか。3つとも見つける人は少数で、2つで十分合格ラインです。</w:t>
+        <w:t xml:space="preserve">仕様違反を何個見つけたか。3つとも見つける人は少数で、2つで十分合格ラインです。</w:t>
       </w:r>
     </w:p>
     <w:p>
@@ -963,7 +1111,7 @@
         <w:spacing w:after="60" w:line="300"/>
       </w:pPr>
       <w:r>
-        <w:t xml:space="preserve">元資料と照合した形跡があるか。資料に印を付ける、並べて読む、Claudeに資料を渡して照合させる、など。</w:t>
+        <w:t xml:space="preserve">指摘の根拠として仕様の項目番号や文言を挙げているか。「なんとなく怪しい」ではなく、仕様との照合ができているかを見ます。</w:t>
       </w:r>
     </w:p>
     <w:p>
@@ -976,7 +1124,7 @@
         <w:spacing w:after="60" w:line="300"/>
       </w:pPr>
       <w:r>
-        <w:t xml:space="preserve">Claudeに頼む場合、元資料を渡しているか。資料を渡さず「このメールをチェックして」と頼むと、Claudeは誤りを見つけられません。文体だけ整えて誤りが残ったまま提出するのが典型的な「使われる人」の行動です。</w:t>
+        <w:t xml:space="preserve">説明文の「キャンセル済み注文は除外しています」「テスト済み」をそのまま信じて「マージ可」としていないか。これが典型的な「使われる人」の行動です。</w:t>
       </w:r>
     </w:p>
     <w:p>
@@ -989,7 +1137,12 @@
         <w:spacing w:after="60" w:line="300"/>
       </w:pPr>
       <w:r>
-        <w:t xml:space="preserve">「上限3万円」のような、もっともらしい記述を疑えたか。捏造を見抜くには「元資料にあるか」という問いが要ります。</w:t>
+        <w:t xml:space="preserve">「テストコードが添付されていない」こと自体を指摘した人は、根拠を要求する姿勢があると評価できます。</w:t>
+      </w:r>
+    </w:p>
+    <w:p>
+      <w:r>
+        <w:br w:type="page"/>
       </w:r>
     </w:p>
     <w:p>
@@ -1146,7 +1299,7 @@
                 <w:sz w:val="19"/>
                 <w:szCs w:val="19"/>
               </w:rPr>
-              <w:t xml:space="preserve">新人派遣スタッフ3名向け／社内チャットツールの使い方を説明するため</w:t>
+              <w:t xml:space="preserve">経理部が月次の売上データをExcelで集計するため／注文データのCSVダウンロード機能</w:t>
             </w:r>
           </w:p>
         </w:tc>
@@ -1199,7 +1352,7 @@
                 <w:sz w:val="19"/>
                 <w:szCs w:val="19"/>
               </w:rPr>
-              <w:t xml:space="preserve">3名はPC操作に不慣れ／ツールはMicrosoft Teams</w:t>
+              <w:t xml:space="preserve">Python / FastAPI、PostgreSQL／既存の /orders と認証の仕組み／売上テーブルは約100万行</w:t>
             </w:r>
           </w:p>
         </w:tc>
@@ -1252,7 +1405,7 @@
                 <w:sz w:val="19"/>
                 <w:szCs w:val="19"/>
               </w:rPr>
-              <w:t xml:space="preserve">説明時間は15分／顧客情報をチャットに貼らないルールを含める／堅すぎないトーン</w:t>
+              <w:t xml:space="preserve">全件をメモリに載せない／氏名・住所・電話番号は出力しない／型ヒント必須／既存テストを壊さない／差分を小さく分ける／期限2週間</w:t>
             </w:r>
           </w:p>
         </w:tc>
@@ -1260,7 +1413,7 @@
     </w:tbl>
     <w:p>
       <w:pPr>
-        <w:spacing w:after="80" w:line="300"/>
+        <w:spacing w:after="120" w:line="300"/>
       </w:pPr>
       <w:r>
         <w:t xml:space="preserve"/>
@@ -1387,7 +1540,7 @@
                 <w:sz w:val="19"/>
                 <w:szCs w:val="19"/>
               </w:rPr>
-              <w:t xml:space="preserve">Teamsの使い方の資料を作って。</w:t>
+              <w:t xml:space="preserve">/orders にCSV出力をつけて。</w:t>
             </w:r>
           </w:p>
         </w:tc>
@@ -1410,7 +1563,7 @@
                 <w:sz w:val="19"/>
                 <w:szCs w:val="19"/>
               </w:rPr>
-              <w:t xml:space="preserve">来週、PC操作に不慣れな新人派遣スタッフ3名に、Microsoft Teamsの基本的な使い方を15分で説明します。その説明資料を作ってください。チャット、通話、ファイル共有の基本操作に絞り、専門用語は避けてください。「顧客情報をチャットに貼らない」という社内ルールは必ず入れてください。堅すぎない、親しみやすいトーンでお願いします。</w:t>
+              <w:t xml:space="preserve">受注管理システム(Python / FastAPI、PostgreSQL)に、経理部が月次売上をExcelで集計するためのCSVダウンロード機能を追加したい。既存の /orders エンドポイントと認証の仕組みを使い、期間を指定して注文を出力する。売上テーブルは約100万行なので、全件をメモリに載せずストリーミングで返すこと。氏名・住所・電話番号の列は出力しない。型ヒント必須、既存テストは壊さない。まずエンドポイントの設計案と、差分を小さく分ける実装手順を提案してほしい。</w:t>
             </w:r>
           </w:p>
         </w:tc>
@@ -1463,7 +1616,7 @@
         <w:spacing w:after="60" w:line="300"/>
       </w:pPr>
       <w:r>
-        <w:t xml:space="preserve">「実際にClaudeに送って結果を見てから依頼文を直した」人は、やり直しを恐れない行動として講義中に取り上げる価値があります。</w:t>
+        <w:t xml:space="preserve">「まず設計案を出して」「手順を分けて」のように、一度に全部を頼まず対話を前提にしている依頼文は、分解とやり直しの意識があるとして講義で取り上げる価値があります。</w:t>
       </w:r>
     </w:p>
     <w:p>
@@ -1476,7 +1629,7 @@
         <w:spacing w:after="60" w:line="300"/>
       </w:pPr>
       <w:r>
-        <w:t xml:space="preserve">状況文を丸ごと貼り付けた人は、文脈を渡す意識はあると評価できます。目的と制約が明示されていれば○で構いません。</w:t>
+        <w:t xml:space="preserve">状況文を丸ごと写した人は、文脈を渡す意識はあると評価できます。目的と制約が明示されていれば○で構いません。</w:t>
       </w:r>
     </w:p>
     <w:p>
@@ -1516,7 +1669,7 @@
         <w:spacing w:after="120" w:line="300"/>
       </w:pPr>
       <w:r>
-        <w:t xml:space="preserve">送り先は正社員。役員と契約社員は今回の変更対象外なので、送らないか、送る場合は「従来通りで変更なし」と明記して別に案内する。元資料の2項目目が根拠です。</w:t>
+        <w:t xml:space="preserve">反対、または保留。根拠は手元の事実です。特定の1ユーザーのみで毎回再現し、他のユーザーは正常で、DBの接続数も平常なら、コネクションプールの枯渇という説明は症状と合いません。ログのNullPointerExceptionと配送先住所の未登録が直接の原因で、本筋は住所未登録時のnull処理の修正と、住所未登録のまま確定画面に進める導線の確認です。</w:t>
       </w:r>
     </w:p>
     <w:p>
@@ -1532,7 +1685,7 @@
           <w:sz w:val="22"/>
           <w:szCs w:val="22"/>
         </w:rPr>
-        <w:t xml:space="preserve">Claudeの典型的な提案</w:t>
+        <w:t xml:space="preserve">Claudeの提案をどう見るか</w:t>
       </w:r>
     </w:p>
     <w:p>
@@ -1540,7 +1693,7 @@
         <w:spacing w:after="120" w:line="300"/>
       </w:pPr>
       <w:r>
-        <w:t xml:space="preserve">元資料を渡さずに相談すると、Claudeは「全社員に送るのが良い」「関係部署にも共有を」といった一般論を返します。これは誤りではなく、Claudeが状況を知らないだけです。</w:t>
+        <w:t xml:space="preserve">Claudeの回答は誤りではなく、「500エラー」という情報しか与えられていないための一般論です。同僚がログの内容と再現条件を渡していれば、別の回答になっていたはずです。この点は講義の「文脈を渡す」と「あなたの状況は知らない」の両方につながります。</w:t>
       </w:r>
     </w:p>
     <w:p>
@@ -1569,7 +1722,7 @@
         <w:spacing w:after="60" w:line="300"/>
       </w:pPr>
       <w:r>
-        <w:t xml:space="preserve">Claudeの提案をそのまま最終判断にしていないか。提案と判断が同じでも、理由に元資料の根拠があれば問題ありません。</w:t>
+        <w:t xml:space="preserve">Claudeの提案をそのまま採用していないか。「とりあえず増やしても害はない」という賛成も、根拠なしに本番設定を変える判断として×とします。</w:t>
       </w:r>
     </w:p>
     <w:p>
@@ -1582,7 +1735,7 @@
         <w:spacing w:after="60" w:line="300"/>
       </w:pPr>
       <w:r>
-        <w:t xml:space="preserve">役員と契約社員を除外、または区別できたか。これが講義の「あなたの状況は知らない」という限界の実例になります。</w:t>
+        <w:t xml:space="preserve">反対の根拠として、与えられた事実(1ユーザーのみ、住所未登録のNPE、DB平常)を挙げているか。</w:t>
       </w:r>
     </w:p>
     <w:p>
@@ -1595,7 +1748,7 @@
         <w:spacing w:after="60" w:line="300"/>
       </w:pPr>
       <w:r>
-        <w:t xml:space="preserve">相談の際に元資料を渡した人は、Claudeから正しい提案を引き出せているはずです。それも○です。</w:t>
+        <w:t xml:space="preserve">「Claudeにログと再現条件を渡して聞き直す」と書いた人は、文脈を渡す意識があると評価できます。C1、C2が満たされていれば加点は不要です。</w:t>
       </w:r>
     </w:p>
     <w:p>
@@ -1776,7 +1929,7 @@
                 <w:sz w:val="19"/>
                 <w:szCs w:val="19"/>
               </w:rPr>
-              <w:t xml:space="preserve">仕込んだ誤りを2個以上見つけた</w:t>
+              <w:t xml:space="preserve">仕込んだ仕様違反を2個以上指摘した</w:t>
             </w:r>
           </w:p>
         </w:tc>
@@ -1799,7 +1952,7 @@
                 <w:sz w:val="19"/>
                 <w:szCs w:val="19"/>
               </w:rPr>
-              <w:t xml:space="preserve">提出されたメール本文</w:t>
+              <w:t xml:space="preserve">提出用紙1</w:t>
             </w:r>
           </w:p>
         </w:tc>
@@ -1852,7 +2005,7 @@
                 <w:sz w:val="19"/>
                 <w:szCs w:val="19"/>
               </w:rPr>
-              <w:t xml:space="preserve">元資料と照合した形跡がある</w:t>
+              <w:t xml:space="preserve">指摘の根拠として、仕様の項目や文言を挙げた</w:t>
             </w:r>
           </w:p>
         </w:tc>
@@ -1875,7 +2028,7 @@
                 <w:sz w:val="19"/>
                 <w:szCs w:val="19"/>
               </w:rPr>
-              <w:t xml:space="preserve">資料への書き込み、または本文が元資料と一致</w:t>
+              <w:t xml:space="preserve">提出用紙1</w:t>
             </w:r>
           </w:p>
         </w:tc>
@@ -1928,7 +2081,7 @@
                 <w:sz w:val="19"/>
                 <w:szCs w:val="19"/>
               </w:rPr>
-              <w:t xml:space="preserve">Claudeに頼む際、元資料を渡した(Claudeを使わなかった場合は自分で照合していれば○)</w:t>
+              <w:t xml:space="preserve">「修正が必要」と判断した(説明文の「テスト済み」を鵜呑みにしなかった)</w:t>
             </w:r>
           </w:p>
         </w:tc>
@@ -1951,7 +2104,7 @@
                 <w:sz w:val="19"/>
                 <w:szCs w:val="19"/>
               </w:rPr>
-              <w:t xml:space="preserve">本人への確認、または画面</w:t>
+              <w:t xml:space="preserve">提出用紙1</w:t>
             </w:r>
           </w:p>
         </w:tc>
@@ -2004,7 +2157,7 @@
                 <w:sz w:val="19"/>
                 <w:szCs w:val="19"/>
               </w:rPr>
-              <w:t xml:space="preserve">依頼文に目的(誰に、何のため)がある</w:t>
+              <w:t xml:space="preserve">依頼文に目的(誰のため、何のため)がある</w:t>
             </w:r>
           </w:p>
         </w:tc>
@@ -2027,7 +2180,7 @@
                 <w:sz w:val="19"/>
                 <w:szCs w:val="19"/>
               </w:rPr>
-              <w:t xml:space="preserve">提出された依頼文</w:t>
+              <w:t xml:space="preserve">提出用紙2</w:t>
             </w:r>
           </w:p>
         </w:tc>
@@ -2080,7 +2233,7 @@
                 <w:sz w:val="19"/>
                 <w:szCs w:val="19"/>
               </w:rPr>
-              <w:t xml:space="preserve">依頼文に文脈(不慣れ、Teams)がある</w:t>
+              <w:t xml:space="preserve">依頼文に文脈(技術スタック、既存API、データ量)がある</w:t>
             </w:r>
           </w:p>
         </w:tc>
@@ -2103,7 +2256,7 @@
                 <w:sz w:val="19"/>
                 <w:szCs w:val="19"/>
               </w:rPr>
-              <w:t xml:space="preserve">提出された依頼文</w:t>
+              <w:t xml:space="preserve">提出用紙2</w:t>
             </w:r>
           </w:p>
         </w:tc>
@@ -2156,7 +2309,7 @@
                 <w:sz w:val="19"/>
                 <w:szCs w:val="19"/>
               </w:rPr>
-              <w:t xml:space="preserve">依頼文に制約(15分、禁止事項、トーン)のいずれかがある</w:t>
+              <w:t xml:space="preserve">依頼文に制約(個人情報、規約、テスト、差分の大きさ)のいずれかがある</w:t>
             </w:r>
           </w:p>
         </w:tc>
@@ -2179,7 +2332,7 @@
                 <w:sz w:val="19"/>
                 <w:szCs w:val="19"/>
               </w:rPr>
-              <w:t xml:space="preserve">提出された依頼文</w:t>
+              <w:t xml:space="preserve">提出用紙2</w:t>
             </w:r>
           </w:p>
         </w:tc>
@@ -2232,7 +2385,7 @@
                 <w:sz w:val="19"/>
                 <w:szCs w:val="19"/>
               </w:rPr>
-              <w:t xml:space="preserve">Claudeの提案と自分の判断が違う場合、理由を書けた(同じ場合は根拠が元資料にあれば○)</w:t>
+              <w:t xml:space="preserve">設定変更に反対、または保留した</w:t>
             </w:r>
           </w:p>
         </w:tc>
@@ -2308,7 +2461,7 @@
                 <w:sz w:val="19"/>
                 <w:szCs w:val="19"/>
               </w:rPr>
-              <w:t xml:space="preserve">送付先から役員と契約社員を除いた、または区別した</w:t>
+              <w:t xml:space="preserve">根拠として手元の事実(1ユーザーのみ、住所未登録、DB平常)を挙げた</w:t>
             </w:r>
           </w:p>
         </w:tc>
@@ -2642,7 +2795,7 @@
         <w:spacing w:after="60" w:line="300"/>
       </w:pPr>
       <w:r>
-        <w:t xml:space="preserve">時間配分：説明3分、課題A 10分、課題B 10分、課題C 5分、記入5分。合計30分強。</w:t>
+        <w:t xml:space="preserve">時間配分：説明3分、課題A 12分、課題B 10分、課題C 5分、見直し3分。合計30分強。</w:t>
       </w:r>
     </w:p>
     <w:p>
@@ -2655,7 +2808,7 @@
         <w:spacing w:after="60" w:line="300"/>
       </w:pPr>
       <w:r>
-        <w:t xml:space="preserve">種明かしは講義の「6つのスキル」の後、「AIの限界」の前に行うと効果的です。「見つけられなかった」体験が、検証の必要性を一番強く伝えます。</w:t>
+        <w:t xml:space="preserve">Claudeは使いません。PCを閉じてもらうと集中しやすく、採点も提出用紙だけで完結します。</w:t>
       </w:r>
     </w:p>
     <w:p>
@@ -2668,7 +2821,7 @@
         <w:spacing w:after="60" w:line="300"/>
       </w:pPr>
       <w:r>
-        <w:t xml:space="preserve">採点は提出物3点を見れば10分程度で終わります。A3だけは本人に「Claudeに何を渡したか」を聞いてください。</w:t>
+        <w:t xml:space="preserve">種明かしは講義の「6つのスキル」の後、「AIの限界」の前に行うと効果的です。課題Aで「テスト済み」を信じてマージ可とした人がいれば、その体験が検証の必要性を一番強く伝えます。</w:t>
       </w:r>
     </w:p>
     <w:p>
@@ -2681,7 +2834,20 @@
         <w:spacing w:after="60" w:line="300"/>
       </w:pPr>
       <w:r>
-        <w:t xml:space="preserve">課題Aで誤りに気づいて指摘した参加者がいたら、講義で発言してもらうと他の参加者への説得力が上がります。</w:t>
+        <w:t xml:space="preserve">採点は提出用紙3点を見れば、1人あたり3分程度で終わります。</w:t>
+      </w:r>
+    </w:p>
+    <w:p>
+      <w:pPr>
+        <w:pStyle w:val="ListParagraph"/>
+        <w:numPr>
+          <w:ilvl w:val="0"/>
+          <w:numId w:val="2"/>
+        </w:numPr>
+        <w:spacing w:after="60" w:line="300"/>
+      </w:pPr>
+      <w:r>
+        <w:t xml:space="preserve">課題Cで反対した参加者に、講義中に理由を話してもらうと、他の参加者への説得力が上がります。</w:t>
       </w:r>
     </w:p>
     <w:p>
@@ -6338,6 +6504,18 @@
     </w:lvl>
   </w:abstractNum>
   <w:abstractNum w:abstractNumId="5" w15:restartNumberingAfterBreak="0">
+    <w:multiLevelType w:val="hybridMultilevel"/>
+    <w:lvl w:ilvl="0" w15:tentative="1">
+      <w:start w:val="1"/>
+      <w:numFmt w:val="decimal"/>
+      <w:lvlText w:val="%1."/>
+      <w:lvlJc w:val="left"/>
+      <w:pPr>
+        <w:ind w:left="480" w:hanging="300"/>
+      </w:pPr>
+    </w:lvl>
+  </w:abstractNum>
+  <w:abstractNum w:abstractNumId="6" w15:restartNumberingAfterBreak="0">
     <w:multiLevelType w:val="hybridMultilevel"/>
     <w:lvl w:ilvl="0" w15:tentative="1">
       <w:start w:val="1"/>

</xml_diff>